<commit_message>
Set archive author (Guangwei Tong), version v1.0.0 and Zenodo concept/version DOI; refresh MANIFEST
</commit_message>
<xml_diff>
--- a/AUTHOR_STATEMENTS.docx
+++ b/AUTHOR_STATEMENTS.docx
@@ -46,10 +46,7 @@
         <w:t xml:space="preserve"> </w:t>
       </w:r>
       <w:r>
-        <w:t xml:space="preserve">(</w:t>
-      </w:r>
-      <w:r>
-        <w:t xml:space="preserve">Research Article).</w:t>
+        <w:t xml:space="preserve">(Research Article).</w:t>
       </w:r>
     </w:p>
     <w:p>
@@ -57,38 +54,7 @@
         <w:pStyle w:val="BlockText"/>
       </w:pPr>
       <w:r>
-        <w:rPr>
-          <w:b/>
-          <w:bCs/>
-        </w:rPr>
-        <w:t xml:space="preserve">To complete before submission</w:t>
-      </w:r>
-      <w:r>
-        <w:t xml:space="preserve"> </w:t>
-      </w:r>
-      <w:r>
-        <w:t xml:space="preserve">— replace every</w:t>
-      </w:r>
-      <w:r>
-        <w:t xml:space="preserve"> </w:t>
-      </w:r>
-      <w:r>
-        <w:rPr>
-          <w:rStyle w:val="VerbatimChar"/>
-        </w:rPr>
-        <w:t xml:space="preserve">&lt;…&gt;</w:t>
-      </w:r>
-      <w:r>
-        <w:t xml:space="preserve"> </w:t>
-      </w:r>
-      <w:r>
-        <w:t xml:space="preserve">below. The Funding and</w:t>
-      </w:r>
-      <w:r>
-        <w:t xml:space="preserve"> </w:t>
-      </w:r>
-      <w:r>
-        <w:t xml:space="preserve">Conflicts sentences are the standard formulations; confirm or edit them.</w:t>
+        <w:t xml:space="preserve">Author declarations for submission.</w:t>
       </w:r>
     </w:p>
     <w:bookmarkStart w:id="9" w:name="funding"/>
@@ -112,19 +78,6 @@
       </w:r>
       <w:r>
         <w:t xml:space="preserve">not-for-profit sectors.</w:t>
-      </w:r>
-    </w:p>
-    <w:p>
-      <w:pPr>
-        <w:pStyle w:val="BodyText"/>
-      </w:pPr>
-      <w:r>
-        <w:rPr>
-          <w:rStyle w:val="VerbatimChar"/>
-          <w:i/>
-          <w:iCs/>
-        </w:rPr>
-        <w:t xml:space="preserve">&lt;If there is a grant, replace with: This work was supported by &lt;funder&gt; (grant number &lt;…&gt;).&gt;</w:t>
       </w:r>
     </w:p>
     <w:bookmarkEnd w:id="9"/>
@@ -201,10 +154,7 @@
               <w:pStyle w:val="Compact"/>
             </w:pPr>
             <w:r>
-              <w:rPr>
-                <w:rStyle w:val="VerbatimChar"/>
-              </w:rPr>
-              <w:t xml:space="preserve">&lt;Author 1&gt;</w:t>
+              <w:t xml:space="preserve">Guangwei Tong</w:t>
             </w:r>
           </w:p>
         </w:tc>
@@ -215,70 +165,7 @@
               <w:pStyle w:val="Compact"/>
             </w:pPr>
             <w:r>
-              <w:rPr>
-                <w:rStyle w:val="VerbatimChar"/>
-              </w:rPr>
-              <w:t xml:space="preserve">&lt;e.g. Conceptualization, Methodology, Software, Formal analysis, Data curation, Validation, Visualization, Writing – original draft&gt;</w:t>
-            </w:r>
-          </w:p>
-        </w:tc>
-      </w:tr>
-      <w:tr>
-        <w:tc>
-          <w:tcPr/>
-          <w:p>
-            <w:pPr>
-              <w:pStyle w:val="Compact"/>
-            </w:pPr>
-            <w:r>
-              <w:rPr>
-                <w:rStyle w:val="VerbatimChar"/>
-              </w:rPr>
-              <w:t xml:space="preserve">&lt;Author 2&gt;</w:t>
-            </w:r>
-          </w:p>
-        </w:tc>
-        <w:tc>
-          <w:tcPr/>
-          <w:p>
-            <w:pPr>
-              <w:pStyle w:val="Compact"/>
-            </w:pPr>
-            <w:r>
-              <w:rPr>
-                <w:rStyle w:val="VerbatimChar"/>
-              </w:rPr>
-              <w:t xml:space="preserve">&lt;e.g. Conceptualization, Methodology, Supervision, Project administration, Writing – review &amp; editing&gt;</w:t>
-            </w:r>
-          </w:p>
-        </w:tc>
-      </w:tr>
-      <w:tr>
-        <w:tc>
-          <w:tcPr/>
-          <w:p>
-            <w:pPr>
-              <w:pStyle w:val="Compact"/>
-            </w:pPr>
-            <w:r>
-              <w:rPr>
-                <w:rStyle w:val="VerbatimChar"/>
-              </w:rPr>
-              <w:t xml:space="preserve">&lt;Author 3&gt;</w:t>
-            </w:r>
-          </w:p>
-        </w:tc>
-        <w:tc>
-          <w:tcPr/>
-          <w:p>
-            <w:pPr>
-              <w:pStyle w:val="Compact"/>
-            </w:pPr>
-            <w:r>
-              <w:rPr>
-                <w:rStyle w:val="VerbatimChar"/>
-              </w:rPr>
-              <w:t xml:space="preserve">&lt;…&gt;</w:t>
+              <w:t xml:space="preserve">Conceptualization, Methodology, Software, Formal analysis, Investigation, Data curation, Visualization, Writing – original draft, Writing – review &amp; editing</w:t>
             </w:r>
           </w:p>
         </w:tc>
@@ -292,96 +179,6 @@
         <w:t xml:space="preserve">All authors read and approved the final manuscript.</w:t>
       </w:r>
     </w:p>
-    <w:p>
-      <w:pPr>
-        <w:pStyle w:val="BodyText"/>
-      </w:pPr>
-      <w:r>
-        <w:rPr>
-          <w:i/>
-          <w:iCs/>
-        </w:rPr>
-        <w:t xml:space="preserve">CRediT roles available:</w:t>
-      </w:r>
-      <w:r>
-        <w:t xml:space="preserve"> </w:t>
-      </w:r>
-      <w:r>
-        <w:t xml:space="preserve">Conceptualization · Data curation · Formal analysis ·</w:t>
-      </w:r>
-      <w:r>
-        <w:t xml:space="preserve"> </w:t>
-      </w:r>
-      <w:r>
-        <w:t xml:space="preserve">Funding acquisition · Investigation · Methodology · Project administration ·</w:t>
-      </w:r>
-      <w:r>
-        <w:t xml:space="preserve"> </w:t>
-      </w:r>
-      <w:r>
-        <w:t xml:space="preserve">Resources · Software · Supervision · Validation · Visualization ·</w:t>
-      </w:r>
-      <w:r>
-        <w:t xml:space="preserve"> </w:t>
-      </w:r>
-      <w:r>
-        <w:t xml:space="preserve">Writing – original draft · Writing – review &amp; editing.</w:t>
-      </w:r>
-    </w:p>
-    <w:p>
-      <w:pPr>
-        <w:pStyle w:val="BodyText"/>
-      </w:pPr>
-      <w:r>
-        <w:rPr>
-          <w:i/>
-          <w:iCs/>
-        </w:rPr>
-        <w:t xml:space="preserve">Do not assign all fourteen roles to one person to fill the table.</w:t>
-      </w:r>
-      <w:r>
-        <w:t xml:space="preserve"> </w:t>
-      </w:r>
-      <w:r>
-        <w:t xml:space="preserve">With one or two</w:t>
-      </w:r>
-      <w:r>
-        <w:t xml:space="preserve"> </w:t>
-      </w:r>
-      <w:r>
-        <w:t xml:space="preserve">authors, five to eight roles each is the norm;</w:t>
-      </w:r>
-      <w:r>
-        <w:t xml:space="preserve"> </w:t>
-      </w:r>
-      <w:r>
-        <w:rPr>
-          <w:rStyle w:val="VerbatimChar"/>
-        </w:rPr>
-        <w:t xml:space="preserve">Funding acquisition</w:t>
-      </w:r>
-      <w:r>
-        <w:t xml:space="preserve"> </w:t>
-      </w:r>
-      <w:r>
-        <w:t xml:space="preserve">and</w:t>
-      </w:r>
-      <w:r>
-        <w:t xml:space="preserve"> </w:t>
-      </w:r>
-      <w:r>
-        <w:rPr>
-          <w:rStyle w:val="VerbatimChar"/>
-        </w:rPr>
-        <w:t xml:space="preserve">Resources</w:t>
-      </w:r>
-      <w:r>
-        <w:t xml:space="preserve"> </w:t>
-      </w:r>
-      <w:r>
-        <w:t xml:space="preserve">are simply absent when there is no funding.</w:t>
-      </w:r>
-    </w:p>
     <w:bookmarkEnd w:id="11"/>
     <w:bookmarkStart w:id="12" w:name="ethical-approval"/>
     <w:p>
@@ -525,19 +322,7 @@
         <w:t xml:space="preserve"> </w:t>
       </w:r>
       <w:r>
-        <w:t xml:space="preserve">https://github.com/Tygg199456/structural-variation-is-invisible-to-snp-distance-dereplication and</w:t>
-      </w:r>
-      <w:r>
-        <w:t xml:space="preserve"> </w:t>
-      </w:r>
-      <w:r>
-        <w:rPr>
-          <w:rStyle w:val="VerbatimChar"/>
-        </w:rPr>
-        <w:t xml:space="preserve">&lt;Zenodo DOI&gt;</w:t>
-      </w:r>
-      <w:r>
-        <w:t xml:space="preserve">.</w:t>
+        <w:t xml:space="preserve">https://github.com/Tygg199456/structural-variation-is-invisible-to-snp-distance-dereplication and https://doi.org/10.5281/zenodo.23353814 (concept DOI; version v1.0.0 is 10.5281/zenodo.23353815).</w:t>
       </w:r>
     </w:p>
     <w:bookmarkEnd w:id="14"/>

</xml_diff>

<commit_message>
Record the full author list (Tong, Zhou co-first; Tian corresponding), funding and multi-author CRediT
</commit_message>
<xml_diff>
--- a/AUTHOR_STATEMENTS.docx
+++ b/AUTHOR_STATEMENTS.docx
@@ -71,13 +71,37 @@
         <w:pStyle w:val="FirstParagraph"/>
       </w:pPr>
       <w:r>
-        <w:t xml:space="preserve">This research received no specific grant from any funding agency, commercial or</w:t>
-      </w:r>
-      <w:r>
-        <w:t xml:space="preserve"> </w:t>
-      </w:r>
-      <w:r>
-        <w:t xml:space="preserve">not-for-profit sectors.</w:t>
+        <w:t xml:space="preserve">This research was supported by the Earmarked Fund for Shanxi Agriculture Research</w:t>
+      </w:r>
+      <w:r>
+        <w:t xml:space="preserve"> </w:t>
+      </w:r>
+      <w:r>
+        <w:t xml:space="preserve">System (2026CYJSTX15-7 to W.X.T.), the University-region Scientific and Technological</w:t>
+      </w:r>
+      <w:r>
+        <w:t xml:space="preserve"> </w:t>
+      </w:r>
+      <w:r>
+        <w:t xml:space="preserve">Collaboration Funds (JSFW25-0151), the Special Fund for Science and Technology</w:t>
+      </w:r>
+      <w:r>
+        <w:t xml:space="preserve"> </w:t>
+      </w:r>
+      <w:r>
+        <w:t xml:space="preserve">Innovation Teams of Shanxi Province (202204051001022 to W.X.T. and S.N.), and the</w:t>
+      </w:r>
+      <w:r>
+        <w:t xml:space="preserve"> </w:t>
+      </w:r>
+      <w:r>
+        <w:t xml:space="preserve">Shanxi Key Laboratory of Animal Disease Research, Prevention and Control</w:t>
+      </w:r>
+      <w:r>
+        <w:t xml:space="preserve"> </w:t>
+      </w:r>
+      <w:r>
+        <w:t xml:space="preserve">(202504010931010).</w:t>
       </w:r>
     </w:p>
     <w:bookmarkEnd w:id="9"/>
@@ -154,7 +178,7 @@
               <w:pStyle w:val="Compact"/>
             </w:pPr>
             <w:r>
-              <w:t xml:space="preserve">Guangwei Tong</w:t>
+              <w:t xml:space="preserve">Guangwei Tong †</w:t>
             </w:r>
           </w:p>
         </w:tc>
@@ -165,12 +189,74 @@
               <w:pStyle w:val="Compact"/>
             </w:pPr>
             <w:r>
-              <w:t xml:space="preserve">Conceptualization, Methodology, Software, Formal analysis, Investigation, Data curation, Visualization, Writing – original draft, Writing – review &amp; editing</w:t>
+              <w:t xml:space="preserve">Conceptualization, Methodology, Software, Formal analysis, Data curation, Visualization, Writing – original draft</w:t>
+            </w:r>
+          </w:p>
+        </w:tc>
+      </w:tr>
+      <w:tr>
+        <w:tc>
+          <w:tcPr/>
+          <w:p>
+            <w:pPr>
+              <w:pStyle w:val="Compact"/>
+            </w:pPr>
+            <w:r>
+              <w:t xml:space="preserve">Yongfei Zhou †</w:t>
+            </w:r>
+          </w:p>
+        </w:tc>
+        <w:tc>
+          <w:tcPr/>
+          <w:p>
+            <w:pPr>
+              <w:pStyle w:val="Compact"/>
+            </w:pPr>
+            <w:r>
+              <w:t xml:space="preserve">Investigation, Validation, Resources, Writing – review &amp; editing</w:t>
+            </w:r>
+          </w:p>
+        </w:tc>
+      </w:tr>
+      <w:tr>
+        <w:tc>
+          <w:tcPr/>
+          <w:p>
+            <w:pPr>
+              <w:pStyle w:val="Compact"/>
+            </w:pPr>
+            <w:r>
+              <w:t xml:space="preserve">Wenxia Tian *</w:t>
+            </w:r>
+          </w:p>
+        </w:tc>
+        <w:tc>
+          <w:tcPr/>
+          <w:p>
+            <w:pPr>
+              <w:pStyle w:val="Compact"/>
+            </w:pPr>
+            <w:r>
+              <w:t xml:space="preserve">Conceptualization, Supervision, Project administration, Funding acquisition, Writing – review &amp; editing</w:t>
             </w:r>
           </w:p>
         </w:tc>
       </w:tr>
     </w:tbl>
+    <w:p>
+      <w:pPr>
+        <w:pStyle w:val="BodyText"/>
+      </w:pPr>
+      <w:r>
+        <w:t xml:space="preserve">† These authors contributed equally to this work. * Corresponding author: Wenxia Tian</w:t>
+      </w:r>
+      <w:r>
+        <w:t xml:space="preserve"> </w:t>
+      </w:r>
+      <w:r>
+        <w:t xml:space="preserve">(18842418106@163.com).</w:t>
+      </w:r>
+    </w:p>
     <w:p>
       <w:pPr>
         <w:pStyle w:val="BodyText"/>

</xml_diff>